<commit_message>
Explain organized notes, save status and backup transfer in student guides
</commit_message>
<xml_diff>
--- a/guide/BFS218-Course-Website-Guide.docx
+++ b/guide/BFS218-Course-Website-Guide.docx
@@ -40,7 +40,7 @@
           <w:b w:val="0"/>
           <w:sz w:val="22"/>
         </w:rPr>
-        <w:t>Updated September 10, 2026. Keep this guide for navigation and learning tools.</w:t>
+        <w:t>Updated September 12, 2026. Keep this guide for navigation and learning tools.</w:t>
       </w:r>
     </w:p>
     <w:tbl>
@@ -288,25 +288,16 @@
       </w:pPr>
       <w:r>
         <w:rPr>
-          <w:rFonts w:ascii="IBM Plex Sans" w:hAnsi="IBM Plex Sans" w:cs="IBM Plex Sans"/>
-          <w:b w:val="0"/>
-          <w:sz w:val="22"/>
-        </w:rPr>
-      </w:r>
-      <w:r>
-        <w:rPr>
           <w:b/>
         </w:rPr>
         <w:t xml:space="preserve">Weekly learning tools: </w:t>
       </w:r>
       <w:r>
-        <w:t>Try the practice activities provided in the week. These website tools support learning; they do not submit work to Blackboard.</w:t>
+        <w:t>Use the starting check to identify ideas you want to revisit; it records your self-rating, not a grade. After a knowledge check, read the explanation for each answer and follow the suggested next step. These tools do not submit work to Blackboard.</w:t>
       </w:r>
     </w:p>
     <w:p>
-      <w:r>
-        <w:br w:type="page"/>
-      </w:r>
+      <w:r/>
     </w:p>
     <w:p>
       <w:pPr>
@@ -322,19 +313,12 @@
       </w:pPr>
       <w:r>
         <w:rPr>
-          <w:rFonts w:ascii="IBM Plex Sans" w:hAnsi="IBM Plex Sans" w:cs="IBM Plex Sans"/>
-          <w:b w:val="0"/>
-          <w:sz w:val="22"/>
+          <w:b/>
         </w:rPr>
+        <w:t xml:space="preserve">Find your work: </w:t>
       </w:r>
       <w:r>
-        <w:rPr>
-          <w:b/>
-        </w:rPr>
-        <w:t xml:space="preserve">Save a copy: </w:t>
-      </w:r>
-      <w:r>
-        <w:t>Notes may be stored only in the browser and device where you entered them. Use the available note export or download controls to keep a separate copy.</w:t>
+        <w:t>Open My notes in the menu. Choose a week to continue writing. Your saved entries are grouped by activity and week; use the search box to find an idea.</w:t>
       </w:r>
     </w:p>
     <w:p>
@@ -343,19 +327,12 @@
       </w:pPr>
       <w:r>
         <w:rPr>
-          <w:rFonts w:ascii="IBM Plex Sans" w:hAnsi="IBM Plex Sans" w:cs="IBM Plex Sans"/>
-          <w:b w:val="0"/>
-          <w:sz w:val="22"/>
+          <w:b/>
         </w:rPr>
+        <w:t xml:space="preserve">Check the save message: </w:t>
       </w:r>
       <w:r>
-        <w:rPr>
-          <w:b/>
-        </w:rPr>
-        <w:t xml:space="preserve">Changing devices: </w:t>
-      </w:r>
-      <w:r>
-        <w:t>A note saved on one device may not appear on another. Do not rely on private browsing, shared computers or cleared browser storage to retain your work.</w:t>
+        <w:t>Notes save automatically in this browser on this device. Wait for Saved in this browser. If the message says Not saved, keep the page open and download a copy before leaving.</w:t>
       </w:r>
     </w:p>
     <w:p>
@@ -364,19 +341,54 @@
       </w:pPr>
       <w:r>
         <w:rPr>
-          <w:rFonts w:ascii="IBM Plex Sans" w:hAnsi="IBM Plex Sans" w:cs="IBM Plex Sans"/>
-          <w:b w:val="0"/>
-          <w:sz w:val="22"/>
+          <w:b/>
         </w:rPr>
+        <w:t xml:space="preserve">Keep an organized copy: </w:t>
       </w:r>
+      <w:r>
+        <w:t>In My notes, choose Download all organized notes (.docx). The Word file keeps your wording and groups your notes with their week or activity.</w:t>
+      </w:r>
+    </w:p>
+    <w:p>
+      <w:pPr>
+        <w:spacing w:after="120"/>
+      </w:pPr>
       <w:r>
         <w:rPr>
           <w:b/>
         </w:rPr>
-        <w:t xml:space="preserve">Your privacy: </w:t>
+        <w:t xml:space="preserve">Move to another device: </w:t>
       </w:r>
       <w:r>
-        <w:t>Use course ideas and examples in your notes. Avoid entering sensitive personal information on a shared device.</w:t>
+        <w:t>Choose Download backup for another device (.json). On the other device, open this same course, go to My notes and choose Restore from a backup file. Notes do not sync automatically between devices.</w:t>
+      </w:r>
+    </w:p>
+    <w:p>
+      <w:pPr>
+        <w:spacing w:after="120"/>
+      </w:pPr>
+      <w:r>
+        <w:rPr>
+          <w:b/>
+        </w:rPr>
+        <w:t xml:space="preserve">Recover another version: </w:t>
+      </w:r>
+      <w:r>
+        <w:t>If two tabs edit the same note, look under Other saved versions for the alternate wording. Check that text before replacing your current note.</w:t>
+      </w:r>
+    </w:p>
+    <w:p>
+      <w:pPr>
+        <w:spacing w:after="120"/>
+      </w:pPr>
+      <w:r>
+        <w:rPr>
+          <w:b/>
+        </w:rPr>
+        <w:t xml:space="preserve">Shared devices: </w:t>
+      </w:r>
+      <w:r>
+        <w:t>Download your work before using Clear My Work or clearing browser data. Avoid relying on private browsing to keep notes after the session ends.</w:t>
       </w:r>
     </w:p>
     <w:p>

</xml_diff>